<commit_message>
minor assignment 3: trim screenshots in documentation
</commit_message>
<xml_diff>
--- a/minorProj3/Documentation/MinorProject3_FitnessStudio.docx
+++ b/minorProj3/Documentation/MinorProject3_FitnessStudio.docx
@@ -25,7 +25,7 @@
       <w:r>
         <w:t xml:space="preserve">Repository: </w:t>
       </w:r>
-      <w:hyperlink w:history="1" r:id="rIdpfov-c0xcd6fhw2mh8mkn">
+      <w:hyperlink w:history="1" r:id="rIdkbet_iamffrv2ihm0bbtj">
         <w:r>
           <w:rPr>
             <w:rStyle w:val="Hyperlink"/>
@@ -847,6 +847,14 @@
     </w:p>
     <w:p>
       <w:pPr>
+        <w:spacing w:after="120"/>
+      </w:pPr>
+      <w:r>
+        <w:t xml:space="preserve">A selection of screenshots is shown below. The full set of 32, covering every table and the error handling, is in the repository under minorProj3/Documentation/screenshots.</w:t>
+      </w:r>
+    </w:p>
+    <w:p>
+      <w:pPr>
         <w:pStyle w:val="Heading2"/>
         <w:spacing w:after="100" w:before="200"/>
       </w:pPr>
@@ -982,6 +990,15 @@
     </w:p>
     <w:p>
       <w:pPr>
+        <w:pStyle w:val="Heading2"/>
+        <w:spacing w:after="100" w:before="200"/>
+      </w:pPr>
+      <w:r>
+        <w:t xml:space="preserve">Insert</w:t>
+      </w:r>
+    </w:p>
+    <w:p>
+      <w:pPr>
         <w:keepNext/>
         <w:spacing w:after="60" w:before="120"/>
         <w:jc w:val="center"/>
@@ -991,7 +1008,7 @@
           <wp:inline distT="0" distB="0" distL="0" distR="0">
             <wp:extent cx="5943600" cy="3714750"/>
             <wp:effectExtent t="0" r="0" b="0" l="0"/>
-            <wp:docPr id="3" name="04_search_any_field.png" descr="Search members: any field contains &quot;son&quot;" title="Search members: any field contains &quot;son&quot;"/>
+            <wp:docPr id="3" name="05_member_insert_form.png" descr="Insert: new member form" title="Insert: new member form"/>
             <wp:cNvGraphicFramePr>
               <a:graphicFrameLocks xmlns:a="http://schemas.openxmlformats.org/drawingml/2006/main" noChangeAspect="1"/>
             </wp:cNvGraphicFramePr>
@@ -1040,16 +1057,7 @@
           <w:sz w:val="20"/>
           <w:szCs w:val="20"/>
         </w:rPr>
-        <w:t xml:space="preserve">Search members: any field contains "son"</w:t>
-      </w:r>
-    </w:p>
-    <w:p>
-      <w:pPr>
-        <w:pStyle w:val="Heading2"/>
-        <w:spacing w:after="100" w:before="200"/>
-      </w:pPr>
-      <w:r>
-        <w:t xml:space="preserve">Insert</w:t>
+        <w:t xml:space="preserve">Insert: new member form</w:t>
       </w:r>
     </w:p>
     <w:p>
@@ -1063,7 +1071,7 @@
           <wp:inline distT="0" distB="0" distL="0" distR="0">
             <wp:extent cx="5943600" cy="3714750"/>
             <wp:effectExtent t="0" r="0" b="0" l="0"/>
-            <wp:docPr id="4" name="05_member_insert_form.png" descr="Insert: new member form" title="Insert: new member form"/>
+            <wp:docPr id="4" name="07_member_insert_search.png" descr="Insert: the new member saved and found by searching last name starts with &quot;Hop&quot;" title="Insert: the new member saved and found by searching last name starts with &quot;Hop&quot;"/>
             <wp:cNvGraphicFramePr>
               <a:graphicFrameLocks xmlns:a="http://schemas.openxmlformats.org/drawingml/2006/main" noChangeAspect="1"/>
             </wp:cNvGraphicFramePr>
@@ -1112,7 +1120,16 @@
           <w:sz w:val="20"/>
           <w:szCs w:val="20"/>
         </w:rPr>
-        <w:t xml:space="preserve">Insert: new member form</w:t>
+        <w:t xml:space="preserve">Insert: the new member saved and found by searching last name starts with "Hop"</w:t>
+      </w:r>
+    </w:p>
+    <w:p>
+      <w:pPr>
+        <w:pStyle w:val="Heading2"/>
+        <w:spacing w:after="100" w:before="200"/>
+      </w:pPr>
+      <w:r>
+        <w:t xml:space="preserve">Update</w:t>
       </w:r>
     </w:p>
     <w:p>
@@ -1126,7 +1143,7 @@
           <wp:inline distT="0" distB="0" distL="0" distR="0">
             <wp:extent cx="5943600" cy="3714750"/>
             <wp:effectExtent t="0" r="0" b="0" l="0"/>
-            <wp:docPr id="5" name="06_member_insert_saved.png" descr="Insert: member saved (confirmation message)" title="Insert: member saved (confirmation message)"/>
+            <wp:docPr id="5" name="08_member_update_form.png" descr="Update: editing the member (new phone number and plan)" title="Update: editing the member (new phone number and plan)"/>
             <wp:cNvGraphicFramePr>
               <a:graphicFrameLocks xmlns:a="http://schemas.openxmlformats.org/drawingml/2006/main" noChangeAspect="1"/>
             </wp:cNvGraphicFramePr>
@@ -1175,7 +1192,7 @@
           <w:sz w:val="20"/>
           <w:szCs w:val="20"/>
         </w:rPr>
-        <w:t xml:space="preserve">Insert: member saved (confirmation message)</w:t>
+        <w:t xml:space="preserve">Update: editing the member (new phone number and plan)</w:t>
       </w:r>
     </w:p>
     <w:p>
@@ -1189,7 +1206,7 @@
           <wp:inline distT="0" distB="0" distL="0" distR="0">
             <wp:extent cx="5943600" cy="3714750"/>
             <wp:effectExtent t="0" r="0" b="0" l="0"/>
-            <wp:docPr id="6" name="07_member_insert_search.png" descr="Insert: the new member found by searching last name starts with &quot;Hop&quot;" title="Insert: the new member found by searching last name starts with &quot;Hop&quot;"/>
+            <wp:docPr id="6" name="09_member_update_saved.png" descr="Update: member saved with the new phone number and plan" title="Update: member saved with the new phone number and plan"/>
             <wp:cNvGraphicFramePr>
               <a:graphicFrameLocks xmlns:a="http://schemas.openxmlformats.org/drawingml/2006/main" noChangeAspect="1"/>
             </wp:cNvGraphicFramePr>
@@ -1238,7 +1255,16 @@
           <w:sz w:val="20"/>
           <w:szCs w:val="20"/>
         </w:rPr>
-        <w:t xml:space="preserve">Insert: the new member found by searching last name starts with "Hop"</w:t>
+        <w:t xml:space="preserve">Update: member saved with the new phone number and plan</w:t>
+      </w:r>
+    </w:p>
+    <w:p>
+      <w:pPr>
+        <w:pStyle w:val="Heading2"/>
+        <w:spacing w:after="100" w:before="200"/>
+      </w:pPr>
+      <w:r>
+        <w:t xml:space="preserve">Delete</w:t>
       </w:r>
     </w:p>
     <w:p>
@@ -1252,7 +1278,7 @@
           <wp:inline distT="0" distB="0" distL="0" distR="0">
             <wp:extent cx="5943600" cy="3714750"/>
             <wp:effectExtent t="0" r="0" b="0" l="0"/>
-            <wp:docPr id="7" name="12_instructor_insert_form.png" descr="Insert: new instructor form" title="Insert: new instructor form"/>
+            <wp:docPr id="7" name="10_member_delete_confirm.png" descr="Delete: member confirmation page" title="Delete: member confirmation page"/>
             <wp:cNvGraphicFramePr>
               <a:graphicFrameLocks xmlns:a="http://schemas.openxmlformats.org/drawingml/2006/main" noChangeAspect="1"/>
             </wp:cNvGraphicFramePr>
@@ -1301,7 +1327,7 @@
           <w:sz w:val="20"/>
           <w:szCs w:val="20"/>
         </w:rPr>
-        <w:t xml:space="preserve">Insert: new instructor form</w:t>
+        <w:t xml:space="preserve">Delete: member confirmation page</w:t>
       </w:r>
     </w:p>
     <w:p>
@@ -1315,7 +1341,7 @@
           <wp:inline distT="0" distB="0" distL="0" distR="0">
             <wp:extent cx="5943600" cy="3714750"/>
             <wp:effectExtent t="0" r="0" b="0" l="0"/>
-            <wp:docPr id="8" name="17_class_insert_form.png" descr="Insert: new class form" title="Insert: new class form"/>
+            <wp:docPr id="8" name="11_member_delete_done.png" descr="Delete: member deleted" title="Delete: member deleted"/>
             <wp:cNvGraphicFramePr>
               <a:graphicFrameLocks xmlns:a="http://schemas.openxmlformats.org/drawingml/2006/main" noChangeAspect="1"/>
             </wp:cNvGraphicFramePr>
@@ -1364,7 +1390,7 @@
           <w:sz w:val="20"/>
           <w:szCs w:val="20"/>
         </w:rPr>
-        <w:t xml:space="preserve">Insert: new class form</w:t>
+        <w:t xml:space="preserve">Delete: member deleted</w:t>
       </w:r>
     </w:p>
     <w:p>
@@ -1376,9 +1402,9 @@
       <w:r>
         <w:drawing>
           <wp:inline distT="0" distB="0" distL="0" distR="0">
-            <wp:extent cx="5943600" cy="4972050"/>
+            <wp:extent cx="5943600" cy="3714750"/>
             <wp:effectExtent t="0" r="0" b="0" l="0"/>
-            <wp:docPr id="9" name="18_class_insert_saved.png" descr="Insert: class saved and shown in the weekly schedule" title="Insert: class saved and shown in the weekly schedule"/>
+            <wp:docPr id="9" name="16_instructor_delete_blocked.png" descr="Delete: an instructor who still teaches classes cannot be deleted, so the app shows a friendly message" title="Delete: an instructor who still teaches classes cannot be deleted, so the app shows a friendly message"/>
             <wp:cNvGraphicFramePr>
               <a:graphicFrameLocks xmlns:a="http://schemas.openxmlformats.org/drawingml/2006/main" noChangeAspect="1"/>
             </wp:cNvGraphicFramePr>
@@ -1401,7 +1427,7 @@
                   <pic:spPr bwMode="auto">
                     <a:xfrm>
                       <a:off x="0" y="0"/>
-                      <a:ext cx="5943600" cy="4972050"/>
+                      <a:ext cx="5943600" cy="3714750"/>
                     </a:xfrm>
                     <a:prstGeom prst="rect">
                       <a:avLst/>
@@ -1427,7 +1453,7 @@
           <w:sz w:val="20"/>
           <w:szCs w:val="20"/>
         </w:rPr>
-        <w:t xml:space="preserve">Insert: class saved and shown in the weekly schedule</w:t>
+        <w:t xml:space="preserve">Delete: an instructor who still teaches classes cannot be deleted, so the app shows a friendly message</w:t>
       </w:r>
     </w:p>
     <w:p>
@@ -1436,7 +1462,7 @@
         <w:spacing w:after="100" w:before="200"/>
       </w:pPr>
       <w:r>
-        <w:t xml:space="preserve">Update</w:t>
+        <w:t xml:space="preserve">Settings and Administration</w:t>
       </w:r>
     </w:p>
     <w:p>
@@ -1448,9 +1474,9 @@
       <w:r>
         <w:drawing>
           <wp:inline distT="0" distB="0" distL="0" distR="0">
-            <wp:extent cx="5943600" cy="3714750"/>
+            <wp:extent cx="5943600" cy="4238625"/>
             <wp:effectExtent t="0" r="0" b="0" l="0"/>
-            <wp:docPr id="10" name="08_member_update_form.png" descr="Update: editing the member (new phone number and plan)" title="Update: editing the member (new phone number and plan)"/>
+            <wp:docPr id="10" name="23_settings_saved_dark.png" descr="Settings: dark theme, green accent, ISO dates, 24-hour clock and administrator mode" title="Settings: dark theme, green accent, ISO dates, 24-hour clock and administrator mode"/>
             <wp:cNvGraphicFramePr>
               <a:graphicFrameLocks xmlns:a="http://schemas.openxmlformats.org/drawingml/2006/main" noChangeAspect="1"/>
             </wp:cNvGraphicFramePr>
@@ -1473,7 +1499,7 @@
                   <pic:spPr bwMode="auto">
                     <a:xfrm>
                       <a:off x="0" y="0"/>
-                      <a:ext cx="5943600" cy="3714750"/>
+                      <a:ext cx="5943600" cy="4238625"/>
                     </a:xfrm>
                     <a:prstGeom prst="rect">
                       <a:avLst/>
@@ -1499,7 +1525,7 @@
           <w:sz w:val="20"/>
           <w:szCs w:val="20"/>
         </w:rPr>
-        <w:t xml:space="preserve">Update: editing the member (new phone number and plan)</w:t>
+        <w:t xml:space="preserve">Settings: dark theme, green accent, ISO dates, 24-hour clock and administrator mode</w:t>
       </w:r>
     </w:p>
     <w:p>
@@ -1513,7 +1539,7 @@
           <wp:inline distT="0" distB="0" distL="0" distR="0">
             <wp:extent cx="5943600" cy="3714750"/>
             <wp:effectExtent t="0" r="0" b="0" l="0"/>
-            <wp:docPr id="11" name="09_member_update_saved.png" descr="Update: member saved with the new phone number and plan" title="Update: member saved with the new phone number and plan"/>
+            <wp:docPr id="11" name="22_admin_locked.png" descr="Administration is locked until administrator mode is turned on" title="Administration is locked until administrator mode is turned on"/>
             <wp:cNvGraphicFramePr>
               <a:graphicFrameLocks xmlns:a="http://schemas.openxmlformats.org/drawingml/2006/main" noChangeAspect="1"/>
             </wp:cNvGraphicFramePr>
@@ -1562,7 +1588,7 @@
           <w:sz w:val="20"/>
           <w:szCs w:val="20"/>
         </w:rPr>
-        <w:t xml:space="preserve">Update: member saved with the new phone number and plan</w:t>
+        <w:t xml:space="preserve">Administration is locked until administrator mode is turned on</w:t>
       </w:r>
     </w:p>
     <w:p>
@@ -1576,7 +1602,7 @@
           <wp:inline distT="0" distB="0" distL="0" distR="0">
             <wp:extent cx="5943600" cy="3714750"/>
             <wp:effectExtent t="0" r="0" b="0" l="0"/>
-            <wp:docPr id="12" name="14_instructor_update_saved.png" descr="Update: instructor specialty changed" title="Update: instructor specialty changed"/>
+            <wp:docPr id="12" name="27_admin_insert_saved.png" descr="Administration (admin-only table): a new membership plan added" title="Administration (admin-only table): a new membership plan added"/>
             <wp:cNvGraphicFramePr>
               <a:graphicFrameLocks xmlns:a="http://schemas.openxmlformats.org/drawingml/2006/main" noChangeAspect="1"/>
             </wp:cNvGraphicFramePr>
@@ -1625,7 +1651,7 @@
           <w:sz w:val="20"/>
           <w:szCs w:val="20"/>
         </w:rPr>
-        <w:t xml:space="preserve">Update: instructor specialty changed</w:t>
+        <w:t xml:space="preserve">Administration (admin-only table): a new membership plan added</w:t>
       </w:r>
     </w:p>
     <w:p>
@@ -1639,7 +1665,7 @@
           <wp:inline distT="0" distB="0" distL="0" distR="0">
             <wp:extent cx="5943600" cy="3714750"/>
             <wp:effectExtent t="0" r="0" b="0" l="0"/>
-            <wp:docPr id="13" name="19_class_update_form.png" descr="Update: editing a class (capacity and room)" title="Update: editing a class (capacity and room)"/>
+            <wp:docPr id="13" name="30_admin_delete_blocked.png" descr="Administration: a plan that members are on cannot be deleted" title="Administration: a plan that members are on cannot be deleted"/>
             <wp:cNvGraphicFramePr>
               <a:graphicFrameLocks xmlns:a="http://schemas.openxmlformats.org/drawingml/2006/main" noChangeAspect="1"/>
             </wp:cNvGraphicFramePr>
@@ -1688,1105 +1714,7 @@
           <w:sz w:val="20"/>
           <w:szCs w:val="20"/>
         </w:rPr>
-        <w:t xml:space="preserve">Update: editing a class (capacity and room)</w:t>
-      </w:r>
-    </w:p>
-    <w:p>
-      <w:pPr>
-        <w:pStyle w:val="Heading2"/>
-        <w:spacing w:after="100" w:before="200"/>
-      </w:pPr>
-      <w:r>
-        <w:t xml:space="preserve">Delete</w:t>
-      </w:r>
-    </w:p>
-    <w:p>
-      <w:pPr>
-        <w:keepNext/>
-        <w:spacing w:after="60" w:before="120"/>
-        <w:jc w:val="center"/>
-      </w:pPr>
-      <w:r>
-        <w:drawing>
-          <wp:inline distT="0" distB="0" distL="0" distR="0">
-            <wp:extent cx="5943600" cy="3714750"/>
-            <wp:effectExtent t="0" r="0" b="0" l="0"/>
-            <wp:docPr id="14" name="10_member_delete_confirm.png" descr="Delete: member confirmation page" title="Delete: member confirmation page"/>
-            <wp:cNvGraphicFramePr>
-              <a:graphicFrameLocks xmlns:a="http://schemas.openxmlformats.org/drawingml/2006/main" noChangeAspect="1"/>
-            </wp:cNvGraphicFramePr>
-            <a:graphic xmlns:a="http://schemas.openxmlformats.org/drawingml/2006/main">
-              <a:graphicData uri="http://schemas.openxmlformats.org/drawingml/2006/picture">
-                <pic:pic xmlns:pic="http://schemas.openxmlformats.org/drawingml/2006/picture">
-                  <pic:nvPicPr>
-                    <pic:cNvPr id="0" name="" descr=""/>
-                    <pic:cNvPicPr>
-                      <a:picLocks noChangeAspect="1" noChangeArrowheads="1"/>
-                    </pic:cNvPicPr>
-                  </pic:nvPicPr>
-                  <pic:blipFill>
-                    <a:blip r:embed="rId21" cstate="none"/>
-                    <a:srcRect/>
-                    <a:stretch>
-                      <a:fillRect/>
-                    </a:stretch>
-                  </pic:blipFill>
-                  <pic:spPr bwMode="auto">
-                    <a:xfrm>
-                      <a:off x="0" y="0"/>
-                      <a:ext cx="5943600" cy="3714750"/>
-                    </a:xfrm>
-                    <a:prstGeom prst="rect">
-                      <a:avLst/>
-                    </a:prstGeom>
-                  </pic:spPr>
-                </pic:pic>
-              </a:graphicData>
-            </a:graphic>
-          </wp:inline>
-        </w:drawing>
-      </w:r>
-    </w:p>
-    <w:p>
-      <w:pPr>
-        <w:spacing w:after="240"/>
-        <w:jc w:val="center"/>
-      </w:pPr>
-      <w:r>
-        <w:rPr>
-          <w:i/>
-          <w:iCs/>
-          <w:color w:val="555555"/>
-          <w:sz w:val="20"/>
-          <w:szCs w:val="20"/>
-        </w:rPr>
-        <w:t xml:space="preserve">Delete: member confirmation page</w:t>
-      </w:r>
-    </w:p>
-    <w:p>
-      <w:pPr>
-        <w:keepNext/>
-        <w:spacing w:after="60" w:before="120"/>
-        <w:jc w:val="center"/>
-      </w:pPr>
-      <w:r>
-        <w:drawing>
-          <wp:inline distT="0" distB="0" distL="0" distR="0">
-            <wp:extent cx="5943600" cy="3714750"/>
-            <wp:effectExtent t="0" r="0" b="0" l="0"/>
-            <wp:docPr id="15" name="11_member_delete_done.png" descr="Delete: member deleted" title="Delete: member deleted"/>
-            <wp:cNvGraphicFramePr>
-              <a:graphicFrameLocks xmlns:a="http://schemas.openxmlformats.org/drawingml/2006/main" noChangeAspect="1"/>
-            </wp:cNvGraphicFramePr>
-            <a:graphic xmlns:a="http://schemas.openxmlformats.org/drawingml/2006/main">
-              <a:graphicData uri="http://schemas.openxmlformats.org/drawingml/2006/picture">
-                <pic:pic xmlns:pic="http://schemas.openxmlformats.org/drawingml/2006/picture">
-                  <pic:nvPicPr>
-                    <pic:cNvPr id="0" name="" descr=""/>
-                    <pic:cNvPicPr>
-                      <a:picLocks noChangeAspect="1" noChangeArrowheads="1"/>
-                    </pic:cNvPicPr>
-                  </pic:nvPicPr>
-                  <pic:blipFill>
-                    <a:blip r:embed="rId22" cstate="none"/>
-                    <a:srcRect/>
-                    <a:stretch>
-                      <a:fillRect/>
-                    </a:stretch>
-                  </pic:blipFill>
-                  <pic:spPr bwMode="auto">
-                    <a:xfrm>
-                      <a:off x="0" y="0"/>
-                      <a:ext cx="5943600" cy="3714750"/>
-                    </a:xfrm>
-                    <a:prstGeom prst="rect">
-                      <a:avLst/>
-                    </a:prstGeom>
-                  </pic:spPr>
-                </pic:pic>
-              </a:graphicData>
-            </a:graphic>
-          </wp:inline>
-        </w:drawing>
-      </w:r>
-    </w:p>
-    <w:p>
-      <w:pPr>
-        <w:spacing w:after="240"/>
-        <w:jc w:val="center"/>
-      </w:pPr>
-      <w:r>
-        <w:rPr>
-          <w:i/>
-          <w:iCs/>
-          <w:color w:val="555555"/>
-          <w:sz w:val="20"/>
-          <w:szCs w:val="20"/>
-        </w:rPr>
-        <w:t xml:space="preserve">Delete: member deleted</w:t>
-      </w:r>
-    </w:p>
-    <w:p>
-      <w:pPr>
-        <w:keepNext/>
-        <w:spacing w:after="60" w:before="120"/>
-        <w:jc w:val="center"/>
-      </w:pPr>
-      <w:r>
-        <w:drawing>
-          <wp:inline distT="0" distB="0" distL="0" distR="0">
-            <wp:extent cx="5943600" cy="3714750"/>
-            <wp:effectExtent t="0" r="0" b="0" l="0"/>
-            <wp:docPr id="16" name="15_instructor_delete_warning.png" descr="Delete: warning for an instructor who still teaches classes" title="Delete: warning for an instructor who still teaches classes"/>
-            <wp:cNvGraphicFramePr>
-              <a:graphicFrameLocks xmlns:a="http://schemas.openxmlformats.org/drawingml/2006/main" noChangeAspect="1"/>
-            </wp:cNvGraphicFramePr>
-            <a:graphic xmlns:a="http://schemas.openxmlformats.org/drawingml/2006/main">
-              <a:graphicData uri="http://schemas.openxmlformats.org/drawingml/2006/picture">
-                <pic:pic xmlns:pic="http://schemas.openxmlformats.org/drawingml/2006/picture">
-                  <pic:nvPicPr>
-                    <pic:cNvPr id="0" name="" descr=""/>
-                    <pic:cNvPicPr>
-                      <a:picLocks noChangeAspect="1" noChangeArrowheads="1"/>
-                    </pic:cNvPicPr>
-                  </pic:nvPicPr>
-                  <pic:blipFill>
-                    <a:blip r:embed="rId23" cstate="none"/>
-                    <a:srcRect/>
-                    <a:stretch>
-                      <a:fillRect/>
-                    </a:stretch>
-                  </pic:blipFill>
-                  <pic:spPr bwMode="auto">
-                    <a:xfrm>
-                      <a:off x="0" y="0"/>
-                      <a:ext cx="5943600" cy="3714750"/>
-                    </a:xfrm>
-                    <a:prstGeom prst="rect">
-                      <a:avLst/>
-                    </a:prstGeom>
-                  </pic:spPr>
-                </pic:pic>
-              </a:graphicData>
-            </a:graphic>
-          </wp:inline>
-        </w:drawing>
-      </w:r>
-    </w:p>
-    <w:p>
-      <w:pPr>
-        <w:spacing w:after="240"/>
-        <w:jc w:val="center"/>
-      </w:pPr>
-      <w:r>
-        <w:rPr>
-          <w:i/>
-          <w:iCs/>
-          <w:color w:val="555555"/>
-          <w:sz w:val="20"/>
-          <w:szCs w:val="20"/>
-        </w:rPr>
-        <w:t xml:space="preserve">Delete: warning for an instructor who still teaches classes</w:t>
-      </w:r>
-    </w:p>
-    <w:p>
-      <w:pPr>
-        <w:keepNext/>
-        <w:spacing w:after="60" w:before="120"/>
-        <w:jc w:val="center"/>
-      </w:pPr>
-      <w:r>
-        <w:drawing>
-          <wp:inline distT="0" distB="0" distL="0" distR="0">
-            <wp:extent cx="5943600" cy="3714750"/>
-            <wp:effectExtent t="0" r="0" b="0" l="0"/>
-            <wp:docPr id="17" name="16_instructor_delete_blocked.png" descr="Delete: the database refuses the delete and the app shows a friendly message" title="Delete: the database refuses the delete and the app shows a friendly message"/>
-            <wp:cNvGraphicFramePr>
-              <a:graphicFrameLocks xmlns:a="http://schemas.openxmlformats.org/drawingml/2006/main" noChangeAspect="1"/>
-            </wp:cNvGraphicFramePr>
-            <a:graphic xmlns:a="http://schemas.openxmlformats.org/drawingml/2006/main">
-              <a:graphicData uri="http://schemas.openxmlformats.org/drawingml/2006/picture">
-                <pic:pic xmlns:pic="http://schemas.openxmlformats.org/drawingml/2006/picture">
-                  <pic:nvPicPr>
-                    <pic:cNvPr id="0" name="" descr=""/>
-                    <pic:cNvPicPr>
-                      <a:picLocks noChangeAspect="1" noChangeArrowheads="1"/>
-                    </pic:cNvPicPr>
-                  </pic:nvPicPr>
-                  <pic:blipFill>
-                    <a:blip r:embed="rId24" cstate="none"/>
-                    <a:srcRect/>
-                    <a:stretch>
-                      <a:fillRect/>
-                    </a:stretch>
-                  </pic:blipFill>
-                  <pic:spPr bwMode="auto">
-                    <a:xfrm>
-                      <a:off x="0" y="0"/>
-                      <a:ext cx="5943600" cy="3714750"/>
-                    </a:xfrm>
-                    <a:prstGeom prst="rect">
-                      <a:avLst/>
-                    </a:prstGeom>
-                  </pic:spPr>
-                </pic:pic>
-              </a:graphicData>
-            </a:graphic>
-          </wp:inline>
-        </w:drawing>
-      </w:r>
-    </w:p>
-    <w:p>
-      <w:pPr>
-        <w:spacing w:after="240"/>
-        <w:jc w:val="center"/>
-      </w:pPr>
-      <w:r>
-        <w:rPr>
-          <w:i/>
-          <w:iCs/>
-          <w:color w:val="555555"/>
-          <w:sz w:val="20"/>
-          <w:szCs w:val="20"/>
-        </w:rPr>
-        <w:t xml:space="preserve">Delete: the database refuses the delete and the app shows a friendly message</w:t>
-      </w:r>
-    </w:p>
-    <w:p>
-      <w:pPr>
-        <w:keepNext/>
-        <w:spacing w:after="60" w:before="120"/>
-        <w:jc w:val="center"/>
-      </w:pPr>
-      <w:r>
-        <w:drawing>
-          <wp:inline distT="0" distB="0" distL="0" distR="0">
-            <wp:extent cx="5943600" cy="3714750"/>
-            <wp:effectExtent t="0" r="0" b="0" l="0"/>
-            <wp:docPr id="18" name="20_class_delete_confirm.png" descr="Delete: class confirmation page" title="Delete: class confirmation page"/>
-            <wp:cNvGraphicFramePr>
-              <a:graphicFrameLocks xmlns:a="http://schemas.openxmlformats.org/drawingml/2006/main" noChangeAspect="1"/>
-            </wp:cNvGraphicFramePr>
-            <a:graphic xmlns:a="http://schemas.openxmlformats.org/drawingml/2006/main">
-              <a:graphicData uri="http://schemas.openxmlformats.org/drawingml/2006/picture">
-                <pic:pic xmlns:pic="http://schemas.openxmlformats.org/drawingml/2006/picture">
-                  <pic:nvPicPr>
-                    <pic:cNvPr id="0" name="" descr=""/>
-                    <pic:cNvPicPr>
-                      <a:picLocks noChangeAspect="1" noChangeArrowheads="1"/>
-                    </pic:cNvPicPr>
-                  </pic:nvPicPr>
-                  <pic:blipFill>
-                    <a:blip r:embed="rId25" cstate="none"/>
-                    <a:srcRect/>
-                    <a:stretch>
-                      <a:fillRect/>
-                    </a:stretch>
-                  </pic:blipFill>
-                  <pic:spPr bwMode="auto">
-                    <a:xfrm>
-                      <a:off x="0" y="0"/>
-                      <a:ext cx="5943600" cy="3714750"/>
-                    </a:xfrm>
-                    <a:prstGeom prst="rect">
-                      <a:avLst/>
-                    </a:prstGeom>
-                  </pic:spPr>
-                </pic:pic>
-              </a:graphicData>
-            </a:graphic>
-          </wp:inline>
-        </w:drawing>
-      </w:r>
-    </w:p>
-    <w:p>
-      <w:pPr>
-        <w:spacing w:after="240"/>
-        <w:jc w:val="center"/>
-      </w:pPr>
-      <w:r>
-        <w:rPr>
-          <w:i/>
-          <w:iCs/>
-          <w:color w:val="555555"/>
-          <w:sz w:val="20"/>
-          <w:szCs w:val="20"/>
-        </w:rPr>
-        <w:t xml:space="preserve">Delete: class confirmation page</w:t>
-      </w:r>
-    </w:p>
-    <w:p>
-      <w:pPr>
-        <w:keepNext/>
-        <w:spacing w:after="60" w:before="120"/>
-        <w:jc w:val="center"/>
-      </w:pPr>
-      <w:r>
-        <w:drawing>
-          <wp:inline distT="0" distB="0" distL="0" distR="0">
-            <wp:extent cx="5943600" cy="3714750"/>
-            <wp:effectExtent t="0" r="0" b="0" l="0"/>
-            <wp:docPr id="19" name="21_instructor_delete_done.png" descr="Delete: instructor with no classes deleted" title="Delete: instructor with no classes deleted"/>
-            <wp:cNvGraphicFramePr>
-              <a:graphicFrameLocks xmlns:a="http://schemas.openxmlformats.org/drawingml/2006/main" noChangeAspect="1"/>
-            </wp:cNvGraphicFramePr>
-            <a:graphic xmlns:a="http://schemas.openxmlformats.org/drawingml/2006/main">
-              <a:graphicData uri="http://schemas.openxmlformats.org/drawingml/2006/picture">
-                <pic:pic xmlns:pic="http://schemas.openxmlformats.org/drawingml/2006/picture">
-                  <pic:nvPicPr>
-                    <pic:cNvPr id="0" name="" descr=""/>
-                    <pic:cNvPicPr>
-                      <a:picLocks noChangeAspect="1" noChangeArrowheads="1"/>
-                    </pic:cNvPicPr>
-                  </pic:nvPicPr>
-                  <pic:blipFill>
-                    <a:blip r:embed="rId26" cstate="none"/>
-                    <a:srcRect/>
-                    <a:stretch>
-                      <a:fillRect/>
-                    </a:stretch>
-                  </pic:blipFill>
-                  <pic:spPr bwMode="auto">
-                    <a:xfrm>
-                      <a:off x="0" y="0"/>
-                      <a:ext cx="5943600" cy="3714750"/>
-                    </a:xfrm>
-                    <a:prstGeom prst="rect">
-                      <a:avLst/>
-                    </a:prstGeom>
-                  </pic:spPr>
-                </pic:pic>
-              </a:graphicData>
-            </a:graphic>
-          </wp:inline>
-        </w:drawing>
-      </w:r>
-    </w:p>
-    <w:p>
-      <w:pPr>
-        <w:spacing w:after="240"/>
-        <w:jc w:val="center"/>
-      </w:pPr>
-      <w:r>
-        <w:rPr>
-          <w:i/>
-          <w:iCs/>
-          <w:color w:val="555555"/>
-          <w:sz w:val="20"/>
-          <w:szCs w:val="20"/>
-        </w:rPr>
-        <w:t xml:space="preserve">Delete: instructor with no classes deleted</w:t>
-      </w:r>
-    </w:p>
-    <w:p>
-      <w:pPr>
-        <w:pStyle w:val="Heading2"/>
-        <w:spacing w:after="100" w:before="200"/>
-      </w:pPr>
-      <w:r>
-        <w:t xml:space="preserve">Settings</w:t>
-      </w:r>
-    </w:p>
-    <w:p>
-      <w:pPr>
-        <w:keepNext/>
-        <w:spacing w:after="60" w:before="120"/>
-        <w:jc w:val="center"/>
-      </w:pPr>
-      <w:r>
-        <w:drawing>
-          <wp:inline distT="0" distB="0" distL="0" distR="0">
-            <wp:extent cx="5943600" cy="4238625"/>
-            <wp:effectExtent t="0" r="0" b="0" l="0"/>
-            <wp:docPr id="20" name="23_settings_saved_dark.png" descr="Settings: dark theme, green accent, ISO dates, 24-hour clock and administrator mode" title="Settings: dark theme, green accent, ISO dates, 24-hour clock and administrator mode"/>
-            <wp:cNvGraphicFramePr>
-              <a:graphicFrameLocks xmlns:a="http://schemas.openxmlformats.org/drawingml/2006/main" noChangeAspect="1"/>
-            </wp:cNvGraphicFramePr>
-            <a:graphic xmlns:a="http://schemas.openxmlformats.org/drawingml/2006/main">
-              <a:graphicData uri="http://schemas.openxmlformats.org/drawingml/2006/picture">
-                <pic:pic xmlns:pic="http://schemas.openxmlformats.org/drawingml/2006/picture">
-                  <pic:nvPicPr>
-                    <pic:cNvPr id="0" name="" descr=""/>
-                    <pic:cNvPicPr>
-                      <a:picLocks noChangeAspect="1" noChangeArrowheads="1"/>
-                    </pic:cNvPicPr>
-                  </pic:nvPicPr>
-                  <pic:blipFill>
-                    <a:blip r:embed="rId27" cstate="none"/>
-                    <a:srcRect/>
-                    <a:stretch>
-                      <a:fillRect/>
-                    </a:stretch>
-                  </pic:blipFill>
-                  <pic:spPr bwMode="auto">
-                    <a:xfrm>
-                      <a:off x="0" y="0"/>
-                      <a:ext cx="5943600" cy="4238625"/>
-                    </a:xfrm>
-                    <a:prstGeom prst="rect">
-                      <a:avLst/>
-                    </a:prstGeom>
-                  </pic:spPr>
-                </pic:pic>
-              </a:graphicData>
-            </a:graphic>
-          </wp:inline>
-        </w:drawing>
-      </w:r>
-    </w:p>
-    <w:p>
-      <w:pPr>
-        <w:spacing w:after="240"/>
-        <w:jc w:val="center"/>
-      </w:pPr>
-      <w:r>
-        <w:rPr>
-          <w:i/>
-          <w:iCs/>
-          <w:color w:val="555555"/>
-          <w:sz w:val="20"/>
-          <w:szCs w:val="20"/>
-        </w:rPr>
-        <w:t xml:space="preserve">Settings: dark theme, green accent, ISO dates, 24-hour clock and administrator mode</w:t>
-      </w:r>
-    </w:p>
-    <w:p>
-      <w:pPr>
-        <w:keepNext/>
-        <w:spacing w:after="60" w:before="120"/>
-        <w:jc w:val="center"/>
-      </w:pPr>
-      <w:r>
-        <w:drawing>
-          <wp:inline distT="0" distB="0" distL="0" distR="0">
-            <wp:extent cx="5943600" cy="4410075"/>
-            <wp:effectExtent t="0" r="0" b="0" l="0"/>
-            <wp:docPr id="21" name="24_classes_dark_24h.png" descr="Settings applied: class schedule in dark theme with a 24-hour clock" title="Settings applied: class schedule in dark theme with a 24-hour clock"/>
-            <wp:cNvGraphicFramePr>
-              <a:graphicFrameLocks xmlns:a="http://schemas.openxmlformats.org/drawingml/2006/main" noChangeAspect="1"/>
-            </wp:cNvGraphicFramePr>
-            <a:graphic xmlns:a="http://schemas.openxmlformats.org/drawingml/2006/main">
-              <a:graphicData uri="http://schemas.openxmlformats.org/drawingml/2006/picture">
-                <pic:pic xmlns:pic="http://schemas.openxmlformats.org/drawingml/2006/picture">
-                  <pic:nvPicPr>
-                    <pic:cNvPr id="0" name="" descr=""/>
-                    <pic:cNvPicPr>
-                      <a:picLocks noChangeAspect="1" noChangeArrowheads="1"/>
-                    </pic:cNvPicPr>
-                  </pic:nvPicPr>
-                  <pic:blipFill>
-                    <a:blip r:embed="rId28" cstate="none"/>
-                    <a:srcRect/>
-                    <a:stretch>
-                      <a:fillRect/>
-                    </a:stretch>
-                  </pic:blipFill>
-                  <pic:spPr bwMode="auto">
-                    <a:xfrm>
-                      <a:off x="0" y="0"/>
-                      <a:ext cx="5943600" cy="4410075"/>
-                    </a:xfrm>
-                    <a:prstGeom prst="rect">
-                      <a:avLst/>
-                    </a:prstGeom>
-                  </pic:spPr>
-                </pic:pic>
-              </a:graphicData>
-            </a:graphic>
-          </wp:inline>
-        </w:drawing>
-      </w:r>
-    </w:p>
-    <w:p>
-      <w:pPr>
-        <w:spacing w:after="240"/>
-        <w:jc w:val="center"/>
-      </w:pPr>
-      <w:r>
-        <w:rPr>
-          <w:i/>
-          <w:iCs/>
-          <w:color w:val="555555"/>
-          <w:sz w:val="20"/>
-          <w:szCs w:val="20"/>
-        </w:rPr>
-        <w:t xml:space="preserve">Settings applied: class schedule in dark theme with a 24-hour clock</w:t>
-      </w:r>
-    </w:p>
-    <w:p>
-      <w:pPr>
-        <w:pStyle w:val="Heading2"/>
-        <w:spacing w:after="100" w:before="200"/>
-      </w:pPr>
-      <w:r>
-        <w:t xml:space="preserve">Administration (admin-only table)</w:t>
-      </w:r>
-    </w:p>
-    <w:p>
-      <w:pPr>
-        <w:keepNext/>
-        <w:spacing w:after="60" w:before="120"/>
-        <w:jc w:val="center"/>
-      </w:pPr>
-      <w:r>
-        <w:drawing>
-          <wp:inline distT="0" distB="0" distL="0" distR="0">
-            <wp:extent cx="5943600" cy="3714750"/>
-            <wp:effectExtent t="0" r="0" b="0" l="0"/>
-            <wp:docPr id="22" name="22_admin_locked.png" descr="Administration is locked until administrator mode is turned on" title="Administration is locked until administrator mode is turned on"/>
-            <wp:cNvGraphicFramePr>
-              <a:graphicFrameLocks xmlns:a="http://schemas.openxmlformats.org/drawingml/2006/main" noChangeAspect="1"/>
-            </wp:cNvGraphicFramePr>
-            <a:graphic xmlns:a="http://schemas.openxmlformats.org/drawingml/2006/main">
-              <a:graphicData uri="http://schemas.openxmlformats.org/drawingml/2006/picture">
-                <pic:pic xmlns:pic="http://schemas.openxmlformats.org/drawingml/2006/picture">
-                  <pic:nvPicPr>
-                    <pic:cNvPr id="0" name="" descr=""/>
-                    <pic:cNvPicPr>
-                      <a:picLocks noChangeAspect="1" noChangeArrowheads="1"/>
-                    </pic:cNvPicPr>
-                  </pic:nvPicPr>
-                  <pic:blipFill>
-                    <a:blip r:embed="rId29" cstate="none"/>
-                    <a:srcRect/>
-                    <a:stretch>
-                      <a:fillRect/>
-                    </a:stretch>
-                  </pic:blipFill>
-                  <pic:spPr bwMode="auto">
-                    <a:xfrm>
-                      <a:off x="0" y="0"/>
-                      <a:ext cx="5943600" cy="3714750"/>
-                    </a:xfrm>
-                    <a:prstGeom prst="rect">
-                      <a:avLst/>
-                    </a:prstGeom>
-                  </pic:spPr>
-                </pic:pic>
-              </a:graphicData>
-            </a:graphic>
-          </wp:inline>
-        </w:drawing>
-      </w:r>
-    </w:p>
-    <w:p>
-      <w:pPr>
-        <w:spacing w:after="240"/>
-        <w:jc w:val="center"/>
-      </w:pPr>
-      <w:r>
-        <w:rPr>
-          <w:i/>
-          <w:iCs/>
-          <w:color w:val="555555"/>
-          <w:sz w:val="20"/>
-          <w:szCs w:val="20"/>
-        </w:rPr>
-        <w:t xml:space="preserve">Administration is locked until administrator mode is turned on</w:t>
-      </w:r>
-    </w:p>
-    <w:p>
-      <w:pPr>
-        <w:keepNext/>
-        <w:spacing w:after="60" w:before="120"/>
-        <w:jc w:val="center"/>
-      </w:pPr>
-      <w:r>
-        <w:drawing>
-          <wp:inline distT="0" distB="0" distL="0" distR="0">
-            <wp:extent cx="5943600" cy="3714750"/>
-            <wp:effectExtent t="0" r="0" b="0" l="0"/>
-            <wp:docPr id="23" name="25_admin_plans.png" descr="Administration: membership plans" title="Administration: membership plans"/>
-            <wp:cNvGraphicFramePr>
-              <a:graphicFrameLocks xmlns:a="http://schemas.openxmlformats.org/drawingml/2006/main" noChangeAspect="1"/>
-            </wp:cNvGraphicFramePr>
-            <a:graphic xmlns:a="http://schemas.openxmlformats.org/drawingml/2006/main">
-              <a:graphicData uri="http://schemas.openxmlformats.org/drawingml/2006/picture">
-                <pic:pic xmlns:pic="http://schemas.openxmlformats.org/drawingml/2006/picture">
-                  <pic:nvPicPr>
-                    <pic:cNvPr id="0" name="" descr=""/>
-                    <pic:cNvPicPr>
-                      <a:picLocks noChangeAspect="1" noChangeArrowheads="1"/>
-                    </pic:cNvPicPr>
-                  </pic:nvPicPr>
-                  <pic:blipFill>
-                    <a:blip r:embed="rId30" cstate="none"/>
-                    <a:srcRect/>
-                    <a:stretch>
-                      <a:fillRect/>
-                    </a:stretch>
-                  </pic:blipFill>
-                  <pic:spPr bwMode="auto">
-                    <a:xfrm>
-                      <a:off x="0" y="0"/>
-                      <a:ext cx="5943600" cy="3714750"/>
-                    </a:xfrm>
-                    <a:prstGeom prst="rect">
-                      <a:avLst/>
-                    </a:prstGeom>
-                  </pic:spPr>
-                </pic:pic>
-              </a:graphicData>
-            </a:graphic>
-          </wp:inline>
-        </w:drawing>
-      </w:r>
-    </w:p>
-    <w:p>
-      <w:pPr>
-        <w:spacing w:after="240"/>
-        <w:jc w:val="center"/>
-      </w:pPr>
-      <w:r>
-        <w:rPr>
-          <w:i/>
-          <w:iCs/>
-          <w:color w:val="555555"/>
-          <w:sz w:val="20"/>
-          <w:szCs w:val="20"/>
-        </w:rPr>
-        <w:t xml:space="preserve">Administration: membership plans</w:t>
-      </w:r>
-    </w:p>
-    <w:p>
-      <w:pPr>
-        <w:keepNext/>
-        <w:spacing w:after="60" w:before="120"/>
-        <w:jc w:val="center"/>
-      </w:pPr>
-      <w:r>
-        <w:drawing>
-          <wp:inline distT="0" distB="0" distL="0" distR="0">
-            <wp:extent cx="5943600" cy="3714750"/>
-            <wp:effectExtent t="0" r="0" b="0" l="0"/>
-            <wp:docPr id="24" name="26_admin_insert_form.png" descr="Administration insert: new &quot;Family&quot; plan" title="Administration insert: new &quot;Family&quot; plan"/>
-            <wp:cNvGraphicFramePr>
-              <a:graphicFrameLocks xmlns:a="http://schemas.openxmlformats.org/drawingml/2006/main" noChangeAspect="1"/>
-            </wp:cNvGraphicFramePr>
-            <a:graphic xmlns:a="http://schemas.openxmlformats.org/drawingml/2006/main">
-              <a:graphicData uri="http://schemas.openxmlformats.org/drawingml/2006/picture">
-                <pic:pic xmlns:pic="http://schemas.openxmlformats.org/drawingml/2006/picture">
-                  <pic:nvPicPr>
-                    <pic:cNvPr id="0" name="" descr=""/>
-                    <pic:cNvPicPr>
-                      <a:picLocks noChangeAspect="1" noChangeArrowheads="1"/>
-                    </pic:cNvPicPr>
-                  </pic:nvPicPr>
-                  <pic:blipFill>
-                    <a:blip r:embed="rId31" cstate="none"/>
-                    <a:srcRect/>
-                    <a:stretch>
-                      <a:fillRect/>
-                    </a:stretch>
-                  </pic:blipFill>
-                  <pic:spPr bwMode="auto">
-                    <a:xfrm>
-                      <a:off x="0" y="0"/>
-                      <a:ext cx="5943600" cy="3714750"/>
-                    </a:xfrm>
-                    <a:prstGeom prst="rect">
-                      <a:avLst/>
-                    </a:prstGeom>
-                  </pic:spPr>
-                </pic:pic>
-              </a:graphicData>
-            </a:graphic>
-          </wp:inline>
-        </w:drawing>
-      </w:r>
-    </w:p>
-    <w:p>
-      <w:pPr>
-        <w:spacing w:after="240"/>
-        <w:jc w:val="center"/>
-      </w:pPr>
-      <w:r>
-        <w:rPr>
-          <w:i/>
-          <w:iCs/>
-          <w:color w:val="555555"/>
-          <w:sz w:val="20"/>
-          <w:szCs w:val="20"/>
-        </w:rPr>
-        <w:t xml:space="preserve">Administration insert: new "Family" plan</w:t>
-      </w:r>
-    </w:p>
-    <w:p>
-      <w:pPr>
-        <w:keepNext/>
-        <w:spacing w:after="60" w:before="120"/>
-        <w:jc w:val="center"/>
-      </w:pPr>
-      <w:r>
-        <w:drawing>
-          <wp:inline distT="0" distB="0" distL="0" distR="0">
-            <wp:extent cx="5943600" cy="3714750"/>
-            <wp:effectExtent t="0" r="0" b="0" l="0"/>
-            <wp:docPr id="25" name="27_admin_insert_saved.png" descr="Administration insert: plan saved" title="Administration insert: plan saved"/>
-            <wp:cNvGraphicFramePr>
-              <a:graphicFrameLocks xmlns:a="http://schemas.openxmlformats.org/drawingml/2006/main" noChangeAspect="1"/>
-            </wp:cNvGraphicFramePr>
-            <a:graphic xmlns:a="http://schemas.openxmlformats.org/drawingml/2006/main">
-              <a:graphicData uri="http://schemas.openxmlformats.org/drawingml/2006/picture">
-                <pic:pic xmlns:pic="http://schemas.openxmlformats.org/drawingml/2006/picture">
-                  <pic:nvPicPr>
-                    <pic:cNvPr id="0" name="" descr=""/>
-                    <pic:cNvPicPr>
-                      <a:picLocks noChangeAspect="1" noChangeArrowheads="1"/>
-                    </pic:cNvPicPr>
-                  </pic:nvPicPr>
-                  <pic:blipFill>
-                    <a:blip r:embed="rId32" cstate="none"/>
-                    <a:srcRect/>
-                    <a:stretch>
-                      <a:fillRect/>
-                    </a:stretch>
-                  </pic:blipFill>
-                  <pic:spPr bwMode="auto">
-                    <a:xfrm>
-                      <a:off x="0" y="0"/>
-                      <a:ext cx="5943600" cy="3714750"/>
-                    </a:xfrm>
-                    <a:prstGeom prst="rect">
-                      <a:avLst/>
-                    </a:prstGeom>
-                  </pic:spPr>
-                </pic:pic>
-              </a:graphicData>
-            </a:graphic>
-          </wp:inline>
-        </w:drawing>
-      </w:r>
-    </w:p>
-    <w:p>
-      <w:pPr>
-        <w:spacing w:after="240"/>
-        <w:jc w:val="center"/>
-      </w:pPr>
-      <w:r>
-        <w:rPr>
-          <w:i/>
-          <w:iCs/>
-          <w:color w:val="555555"/>
-          <w:sz w:val="20"/>
-          <w:szCs w:val="20"/>
-        </w:rPr>
-        <w:t xml:space="preserve">Administration insert: plan saved</w:t>
-      </w:r>
-    </w:p>
-    <w:p>
-      <w:pPr>
-        <w:keepNext/>
-        <w:spacing w:after="60" w:before="120"/>
-        <w:jc w:val="center"/>
-      </w:pPr>
-      <w:r>
-        <w:drawing>
-          <wp:inline distT="0" distB="0" distL="0" distR="0">
-            <wp:extent cx="5943600" cy="3714750"/>
-            <wp:effectExtent t="0" r="0" b="0" l="0"/>
-            <wp:docPr id="26" name="28_admin_update_form.png" descr="Administration update: new price, plan marked inactive" title="Administration update: new price, plan marked inactive"/>
-            <wp:cNvGraphicFramePr>
-              <a:graphicFrameLocks xmlns:a="http://schemas.openxmlformats.org/drawingml/2006/main" noChangeAspect="1"/>
-            </wp:cNvGraphicFramePr>
-            <a:graphic xmlns:a="http://schemas.openxmlformats.org/drawingml/2006/main">
-              <a:graphicData uri="http://schemas.openxmlformats.org/drawingml/2006/picture">
-                <pic:pic xmlns:pic="http://schemas.openxmlformats.org/drawingml/2006/picture">
-                  <pic:nvPicPr>
-                    <pic:cNvPr id="0" name="" descr=""/>
-                    <pic:cNvPicPr>
-                      <a:picLocks noChangeAspect="1" noChangeArrowheads="1"/>
-                    </pic:cNvPicPr>
-                  </pic:nvPicPr>
-                  <pic:blipFill>
-                    <a:blip r:embed="rId33" cstate="none"/>
-                    <a:srcRect/>
-                    <a:stretch>
-                      <a:fillRect/>
-                    </a:stretch>
-                  </pic:blipFill>
-                  <pic:spPr bwMode="auto">
-                    <a:xfrm>
-                      <a:off x="0" y="0"/>
-                      <a:ext cx="5943600" cy="3714750"/>
-                    </a:xfrm>
-                    <a:prstGeom prst="rect">
-                      <a:avLst/>
-                    </a:prstGeom>
-                  </pic:spPr>
-                </pic:pic>
-              </a:graphicData>
-            </a:graphic>
-          </wp:inline>
-        </w:drawing>
-      </w:r>
-    </w:p>
-    <w:p>
-      <w:pPr>
-        <w:spacing w:after="240"/>
-        <w:jc w:val="center"/>
-      </w:pPr>
-      <w:r>
-        <w:rPr>
-          <w:i/>
-          <w:iCs/>
-          <w:color w:val="555555"/>
-          <w:sz w:val="20"/>
-          <w:szCs w:val="20"/>
-        </w:rPr>
-        <w:t xml:space="preserve">Administration update: new price, plan marked inactive</w:t>
-      </w:r>
-    </w:p>
-    <w:p>
-      <w:pPr>
-        <w:keepNext/>
-        <w:spacing w:after="60" w:before="120"/>
-        <w:jc w:val="center"/>
-      </w:pPr>
-      <w:r>
-        <w:drawing>
-          <wp:inline distT="0" distB="0" distL="0" distR="0">
-            <wp:extent cx="5943600" cy="3714750"/>
-            <wp:effectExtent t="0" r="0" b="0" l="0"/>
-            <wp:docPr id="27" name="29_admin_update_saved.png" descr="Administration update: plan saved" title="Administration update: plan saved"/>
-            <wp:cNvGraphicFramePr>
-              <a:graphicFrameLocks xmlns:a="http://schemas.openxmlformats.org/drawingml/2006/main" noChangeAspect="1"/>
-            </wp:cNvGraphicFramePr>
-            <a:graphic xmlns:a="http://schemas.openxmlformats.org/drawingml/2006/main">
-              <a:graphicData uri="http://schemas.openxmlformats.org/drawingml/2006/picture">
-                <pic:pic xmlns:pic="http://schemas.openxmlformats.org/drawingml/2006/picture">
-                  <pic:nvPicPr>
-                    <pic:cNvPr id="0" name="" descr=""/>
-                    <pic:cNvPicPr>
-                      <a:picLocks noChangeAspect="1" noChangeArrowheads="1"/>
-                    </pic:cNvPicPr>
-                  </pic:nvPicPr>
-                  <pic:blipFill>
-                    <a:blip r:embed="rId34" cstate="none"/>
-                    <a:srcRect/>
-                    <a:stretch>
-                      <a:fillRect/>
-                    </a:stretch>
-                  </pic:blipFill>
-                  <pic:spPr bwMode="auto">
-                    <a:xfrm>
-                      <a:off x="0" y="0"/>
-                      <a:ext cx="5943600" cy="3714750"/>
-                    </a:xfrm>
-                    <a:prstGeom prst="rect">
-                      <a:avLst/>
-                    </a:prstGeom>
-                  </pic:spPr>
-                </pic:pic>
-              </a:graphicData>
-            </a:graphic>
-          </wp:inline>
-        </w:drawing>
-      </w:r>
-    </w:p>
-    <w:p>
-      <w:pPr>
-        <w:spacing w:after="240"/>
-        <w:jc w:val="center"/>
-      </w:pPr>
-      <w:r>
-        <w:rPr>
-          <w:i/>
-          <w:iCs/>
-          <w:color w:val="555555"/>
-          <w:sz w:val="20"/>
-          <w:szCs w:val="20"/>
-        </w:rPr>
-        <w:t xml:space="preserve">Administration update: plan saved</w:t>
-      </w:r>
-    </w:p>
-    <w:p>
-      <w:pPr>
-        <w:keepNext/>
-        <w:spacing w:after="60" w:before="120"/>
-        <w:jc w:val="center"/>
-      </w:pPr>
-      <w:r>
-        <w:drawing>
-          <wp:inline distT="0" distB="0" distL="0" distR="0">
-            <wp:extent cx="5943600" cy="3714750"/>
-            <wp:effectExtent t="0" r="0" b="0" l="0"/>
-            <wp:docPr id="28" name="30_admin_delete_blocked.png" descr="Administration delete: a plan that members are on cannot be deleted" title="Administration delete: a plan that members are on cannot be deleted"/>
-            <wp:cNvGraphicFramePr>
-              <a:graphicFrameLocks xmlns:a="http://schemas.openxmlformats.org/drawingml/2006/main" noChangeAspect="1"/>
-            </wp:cNvGraphicFramePr>
-            <a:graphic xmlns:a="http://schemas.openxmlformats.org/drawingml/2006/main">
-              <a:graphicData uri="http://schemas.openxmlformats.org/drawingml/2006/picture">
-                <pic:pic xmlns:pic="http://schemas.openxmlformats.org/drawingml/2006/picture">
-                  <pic:nvPicPr>
-                    <pic:cNvPr id="0" name="" descr=""/>
-                    <pic:cNvPicPr>
-                      <a:picLocks noChangeAspect="1" noChangeArrowheads="1"/>
-                    </pic:cNvPicPr>
-                  </pic:nvPicPr>
-                  <pic:blipFill>
-                    <a:blip r:embed="rId35" cstate="none"/>
-                    <a:srcRect/>
-                    <a:stretch>
-                      <a:fillRect/>
-                    </a:stretch>
-                  </pic:blipFill>
-                  <pic:spPr bwMode="auto">
-                    <a:xfrm>
-                      <a:off x="0" y="0"/>
-                      <a:ext cx="5943600" cy="3714750"/>
-                    </a:xfrm>
-                    <a:prstGeom prst="rect">
-                      <a:avLst/>
-                    </a:prstGeom>
-                  </pic:spPr>
-                </pic:pic>
-              </a:graphicData>
-            </a:graphic>
-          </wp:inline>
-        </w:drawing>
-      </w:r>
-    </w:p>
-    <w:p>
-      <w:pPr>
-        <w:spacing w:after="240"/>
-        <w:jc w:val="center"/>
-      </w:pPr>
-      <w:r>
-        <w:rPr>
-          <w:i/>
-          <w:iCs/>
-          <w:color w:val="555555"/>
-          <w:sz w:val="20"/>
-          <w:szCs w:val="20"/>
-        </w:rPr>
-        <w:t xml:space="preserve">Administration delete: a plan that members are on cannot be deleted</w:t>
-      </w:r>
-    </w:p>
-    <w:p>
-      <w:pPr>
-        <w:keepNext/>
-        <w:spacing w:after="60" w:before="120"/>
-        <w:jc w:val="center"/>
-      </w:pPr>
-      <w:r>
-        <w:drawing>
-          <wp:inline distT="0" distB="0" distL="0" distR="0">
-            <wp:extent cx="5943600" cy="3714750"/>
-            <wp:effectExtent t="0" r="0" b="0" l="0"/>
-            <wp:docPr id="29" name="31_admin_delete_confirm.png" descr="Administration delete: confirmation page" title="Administration delete: confirmation page"/>
-            <wp:cNvGraphicFramePr>
-              <a:graphicFrameLocks xmlns:a="http://schemas.openxmlformats.org/drawingml/2006/main" noChangeAspect="1"/>
-            </wp:cNvGraphicFramePr>
-            <a:graphic xmlns:a="http://schemas.openxmlformats.org/drawingml/2006/main">
-              <a:graphicData uri="http://schemas.openxmlformats.org/drawingml/2006/picture">
-                <pic:pic xmlns:pic="http://schemas.openxmlformats.org/drawingml/2006/picture">
-                  <pic:nvPicPr>
-                    <pic:cNvPr id="0" name="" descr=""/>
-                    <pic:cNvPicPr>
-                      <a:picLocks noChangeAspect="1" noChangeArrowheads="1"/>
-                    </pic:cNvPicPr>
-                  </pic:nvPicPr>
-                  <pic:blipFill>
-                    <a:blip r:embed="rId36" cstate="none"/>
-                    <a:srcRect/>
-                    <a:stretch>
-                      <a:fillRect/>
-                    </a:stretch>
-                  </pic:blipFill>
-                  <pic:spPr bwMode="auto">
-                    <a:xfrm>
-                      <a:off x="0" y="0"/>
-                      <a:ext cx="5943600" cy="3714750"/>
-                    </a:xfrm>
-                    <a:prstGeom prst="rect">
-                      <a:avLst/>
-                    </a:prstGeom>
-                  </pic:spPr>
-                </pic:pic>
-              </a:graphicData>
-            </a:graphic>
-          </wp:inline>
-        </w:drawing>
-      </w:r>
-    </w:p>
-    <w:p>
-      <w:pPr>
-        <w:spacing w:after="240"/>
-        <w:jc w:val="center"/>
-      </w:pPr>
-      <w:r>
-        <w:rPr>
-          <w:i/>
-          <w:iCs/>
-          <w:color w:val="555555"/>
-          <w:sz w:val="20"/>
-          <w:szCs w:val="20"/>
-        </w:rPr>
-        <w:t xml:space="preserve">Administration delete: confirmation page</w:t>
-      </w:r>
-    </w:p>
-    <w:p>
-      <w:pPr>
-        <w:keepNext/>
-        <w:spacing w:after="60" w:before="120"/>
-        <w:jc w:val="center"/>
-      </w:pPr>
-      <w:r>
-        <w:drawing>
-          <wp:inline distT="0" distB="0" distL="0" distR="0">
-            <wp:extent cx="5943600" cy="3714750"/>
-            <wp:effectExtent t="0" r="0" b="0" l="0"/>
-            <wp:docPr id="30" name="32_admin_delete_done.png" descr="Administration delete: plan deleted" title="Administration delete: plan deleted"/>
-            <wp:cNvGraphicFramePr>
-              <a:graphicFrameLocks xmlns:a="http://schemas.openxmlformats.org/drawingml/2006/main" noChangeAspect="1"/>
-            </wp:cNvGraphicFramePr>
-            <a:graphic xmlns:a="http://schemas.openxmlformats.org/drawingml/2006/main">
-              <a:graphicData uri="http://schemas.openxmlformats.org/drawingml/2006/picture">
-                <pic:pic xmlns:pic="http://schemas.openxmlformats.org/drawingml/2006/picture">
-                  <pic:nvPicPr>
-                    <pic:cNvPr id="0" name="" descr=""/>
-                    <pic:cNvPicPr>
-                      <a:picLocks noChangeAspect="1" noChangeArrowheads="1"/>
-                    </pic:cNvPicPr>
-                  </pic:nvPicPr>
-                  <pic:blipFill>
-                    <a:blip r:embed="rId37" cstate="none"/>
-                    <a:srcRect/>
-                    <a:stretch>
-                      <a:fillRect/>
-                    </a:stretch>
-                  </pic:blipFill>
-                  <pic:spPr bwMode="auto">
-                    <a:xfrm>
-                      <a:off x="0" y="0"/>
-                      <a:ext cx="5943600" cy="3714750"/>
-                    </a:xfrm>
-                    <a:prstGeom prst="rect">
-                      <a:avLst/>
-                    </a:prstGeom>
-                  </pic:spPr>
-                </pic:pic>
-              </a:graphicData>
-            </a:graphic>
-          </wp:inline>
-        </w:drawing>
-      </w:r>
-    </w:p>
-    <w:p>
-      <w:pPr>
-        <w:spacing w:after="240"/>
-        <w:jc w:val="center"/>
-      </w:pPr>
-      <w:r>
-        <w:rPr>
-          <w:i/>
-          <w:iCs/>
-          <w:color w:val="555555"/>
-          <w:sz w:val="20"/>
-          <w:szCs w:val="20"/>
-        </w:rPr>
-        <w:t xml:space="preserve">Administration delete: plan deleted</w:t>
+        <w:t xml:space="preserve">Administration: a plan that members are on cannot be deleted</w:t>
       </w:r>
     </w:p>
     <w:p>

</xml_diff>